<commit_message>
hoan thanh giay to in cho Tuan
</commit_message>
<xml_diff>
--- a/src/main/resources/templates/DanhMucHoSoChoVay.docx
+++ b/src/main/resources/templates/DanhMucHoSoChoVay.docx
@@ -197,26 +197,6 @@
           <w:rFonts w:ascii="Times New Roman" w:hAnsi="Times New Roman"/>
           <w:sz w:val="26"/>
         </w:rPr>
-        <w:t>Loại hình cho vay: {{lvt}}</w:t>
-      </w:r>
-    </w:p>
-    <w:p>
-      <w:pPr>
-        <w:pStyle w:val="ListParagraph"/>
-        <w:numPr>
-          <w:ilvl w:val="0"/>
-          <w:numId w:val="1"/>
-        </w:numPr>
-        <w:rPr>
-          <w:rFonts w:ascii="Times New Roman" w:hAnsi="Times New Roman"/>
-          <w:sz w:val="26"/>
-        </w:rPr>
-      </w:pPr>
-      <w:r>
-        <w:rPr>
-          <w:rFonts w:ascii="Times New Roman" w:hAnsi="Times New Roman"/>
-          <w:sz w:val="26"/>
-        </w:rPr>
         <w:t>Thời hạ</w:t>
       </w:r>
       <w:r>
@@ -224,16 +204,7 @@
           <w:rFonts w:ascii="Times New Roman" w:hAnsi="Times New Roman"/>
           <w:sz w:val="26"/>
         </w:rPr>
-        <w:t>n duy trì: {{thv</w:t>
-      </w:r>
-      <w:bookmarkStart w:id="0" w:name="_GoBack"/>
-      <w:bookmarkEnd w:id="0"/>
-      <w:r>
-        <w:rPr>
-          <w:rFonts w:ascii="Times New Roman" w:hAnsi="Times New Roman"/>
-          <w:sz w:val="26"/>
-        </w:rPr>
-        <w:t>}}</w:t>
+        <w:t>n duy trì: {{thv}}</w:t>
       </w:r>
       <w:r>
         <w:rPr>
@@ -266,9 +237,9 @@
       </w:tblPr>
       <w:tblGrid>
         <w:gridCol w:w="715"/>
-        <w:gridCol w:w="5026"/>
-        <w:gridCol w:w="1274"/>
-        <w:gridCol w:w="1615"/>
+        <w:gridCol w:w="5040"/>
+        <w:gridCol w:w="996"/>
+        <w:gridCol w:w="1545"/>
       </w:tblGrid>
       <w:tr>
         <w:tc>
@@ -298,7 +269,7 @@
         </w:tc>
         <w:tc>
           <w:tcPr>
-            <w:tcW w:w="5026" w:type="dxa"/>
+            <w:tcW w:w="5040" w:type="dxa"/>
           </w:tcPr>
           <w:p>
             <w:pPr>
@@ -323,7 +294,7 @@
         </w:tc>
         <w:tc>
           <w:tcPr>
-            <w:tcW w:w="1274" w:type="dxa"/>
+            <w:tcW w:w="996" w:type="dxa"/>
           </w:tcPr>
           <w:p>
             <w:pPr>
@@ -348,7 +319,7 @@
         </w:tc>
         <w:tc>
           <w:tcPr>
-            <w:tcW w:w="1615" w:type="dxa"/>
+            <w:tcW w:w="1545" w:type="dxa"/>
           </w:tcPr>
           <w:p>
             <w:pPr>
@@ -400,7 +371,7 @@
         </w:tc>
         <w:tc>
           <w:tcPr>
-            <w:tcW w:w="5026" w:type="dxa"/>
+            <w:tcW w:w="5040" w:type="dxa"/>
           </w:tcPr>
           <w:p>
             <w:pPr>
@@ -424,22 +395,22 @@
         </w:tc>
         <w:tc>
           <w:tcPr>
-            <w:tcW w:w="1274" w:type="dxa"/>
-          </w:tcPr>
-          <w:p>
-            <w:pPr>
-              <w:pStyle w:val="ListParagraph"/>
-              <w:ind w:left="0"/>
-              <w:rPr>
-                <w:rFonts w:ascii="Times New Roman" w:hAnsi="Times New Roman"/>
-                <w:sz w:val="26"/>
-              </w:rPr>
-            </w:pPr>
-          </w:p>
-        </w:tc>
-        <w:tc>
-          <w:tcPr>
-            <w:tcW w:w="1615" w:type="dxa"/>
+            <w:tcW w:w="996" w:type="dxa"/>
+          </w:tcPr>
+          <w:p>
+            <w:pPr>
+              <w:pStyle w:val="ListParagraph"/>
+              <w:ind w:left="0"/>
+              <w:rPr>
+                <w:rFonts w:ascii="Times New Roman" w:hAnsi="Times New Roman"/>
+                <w:sz w:val="26"/>
+              </w:rPr>
+            </w:pPr>
+          </w:p>
+        </w:tc>
+        <w:tc>
+          <w:tcPr>
+            <w:tcW w:w="1545" w:type="dxa"/>
           </w:tcPr>
           <w:p>
             <w:pPr>
@@ -479,7 +450,7 @@
         </w:tc>
         <w:tc>
           <w:tcPr>
-            <w:tcW w:w="5026" w:type="dxa"/>
+            <w:tcW w:w="5040" w:type="dxa"/>
           </w:tcPr>
           <w:p>
             <w:pPr>
@@ -501,22 +472,22 @@
         </w:tc>
         <w:tc>
           <w:tcPr>
-            <w:tcW w:w="1274" w:type="dxa"/>
-          </w:tcPr>
-          <w:p>
-            <w:pPr>
-              <w:pStyle w:val="ListParagraph"/>
-              <w:ind w:left="0"/>
-              <w:rPr>
-                <w:rFonts w:ascii="Times New Roman" w:hAnsi="Times New Roman"/>
-                <w:sz w:val="26"/>
-              </w:rPr>
-            </w:pPr>
-          </w:p>
-        </w:tc>
-        <w:tc>
-          <w:tcPr>
-            <w:tcW w:w="1615" w:type="dxa"/>
+            <w:tcW w:w="996" w:type="dxa"/>
+          </w:tcPr>
+          <w:p>
+            <w:pPr>
+              <w:pStyle w:val="ListParagraph"/>
+              <w:ind w:left="0"/>
+              <w:rPr>
+                <w:rFonts w:ascii="Times New Roman" w:hAnsi="Times New Roman"/>
+                <w:sz w:val="26"/>
+              </w:rPr>
+            </w:pPr>
+          </w:p>
+        </w:tc>
+        <w:tc>
+          <w:tcPr>
+            <w:tcW w:w="1545" w:type="dxa"/>
           </w:tcPr>
           <w:p>
             <w:pPr>
@@ -556,7 +527,7 @@
         </w:tc>
         <w:tc>
           <w:tcPr>
-            <w:tcW w:w="5026" w:type="dxa"/>
+            <w:tcW w:w="5040" w:type="dxa"/>
           </w:tcPr>
           <w:p>
             <w:pPr>
@@ -578,22 +549,22 @@
         </w:tc>
         <w:tc>
           <w:tcPr>
-            <w:tcW w:w="1274" w:type="dxa"/>
-          </w:tcPr>
-          <w:p>
-            <w:pPr>
-              <w:pStyle w:val="ListParagraph"/>
-              <w:ind w:left="0"/>
-              <w:rPr>
-                <w:rFonts w:ascii="Times New Roman" w:hAnsi="Times New Roman"/>
-                <w:sz w:val="26"/>
-              </w:rPr>
-            </w:pPr>
-          </w:p>
-        </w:tc>
-        <w:tc>
-          <w:tcPr>
-            <w:tcW w:w="1615" w:type="dxa"/>
+            <w:tcW w:w="996" w:type="dxa"/>
+          </w:tcPr>
+          <w:p>
+            <w:pPr>
+              <w:pStyle w:val="ListParagraph"/>
+              <w:ind w:left="0"/>
+              <w:rPr>
+                <w:rFonts w:ascii="Times New Roman" w:hAnsi="Times New Roman"/>
+                <w:sz w:val="26"/>
+              </w:rPr>
+            </w:pPr>
+          </w:p>
+        </w:tc>
+        <w:tc>
+          <w:tcPr>
+            <w:tcW w:w="1545" w:type="dxa"/>
           </w:tcPr>
           <w:p>
             <w:pPr>
@@ -633,7 +604,7 @@
         </w:tc>
         <w:tc>
           <w:tcPr>
-            <w:tcW w:w="5026" w:type="dxa"/>
+            <w:tcW w:w="5040" w:type="dxa"/>
           </w:tcPr>
           <w:p>
             <w:pPr>
@@ -655,22 +626,22 @@
         </w:tc>
         <w:tc>
           <w:tcPr>
-            <w:tcW w:w="1274" w:type="dxa"/>
-          </w:tcPr>
-          <w:p>
-            <w:pPr>
-              <w:pStyle w:val="ListParagraph"/>
-              <w:ind w:left="0"/>
-              <w:rPr>
-                <w:rFonts w:ascii="Times New Roman" w:hAnsi="Times New Roman"/>
-                <w:sz w:val="26"/>
-              </w:rPr>
-            </w:pPr>
-          </w:p>
-        </w:tc>
-        <w:tc>
-          <w:tcPr>
-            <w:tcW w:w="1615" w:type="dxa"/>
+            <w:tcW w:w="996" w:type="dxa"/>
+          </w:tcPr>
+          <w:p>
+            <w:pPr>
+              <w:pStyle w:val="ListParagraph"/>
+              <w:ind w:left="0"/>
+              <w:rPr>
+                <w:rFonts w:ascii="Times New Roman" w:hAnsi="Times New Roman"/>
+                <w:sz w:val="26"/>
+              </w:rPr>
+            </w:pPr>
+          </w:p>
+        </w:tc>
+        <w:tc>
+          <w:tcPr>
+            <w:tcW w:w="1545" w:type="dxa"/>
           </w:tcPr>
           <w:p>
             <w:pPr>
@@ -710,7 +681,7 @@
         </w:tc>
         <w:tc>
           <w:tcPr>
-            <w:tcW w:w="5026" w:type="dxa"/>
+            <w:tcW w:w="5040" w:type="dxa"/>
           </w:tcPr>
           <w:p>
             <w:pPr>
@@ -732,22 +703,22 @@
         </w:tc>
         <w:tc>
           <w:tcPr>
-            <w:tcW w:w="1274" w:type="dxa"/>
-          </w:tcPr>
-          <w:p>
-            <w:pPr>
-              <w:pStyle w:val="ListParagraph"/>
-              <w:ind w:left="0"/>
-              <w:rPr>
-                <w:rFonts w:ascii="Times New Roman" w:hAnsi="Times New Roman"/>
-                <w:sz w:val="26"/>
-              </w:rPr>
-            </w:pPr>
-          </w:p>
-        </w:tc>
-        <w:tc>
-          <w:tcPr>
-            <w:tcW w:w="1615" w:type="dxa"/>
+            <w:tcW w:w="996" w:type="dxa"/>
+          </w:tcPr>
+          <w:p>
+            <w:pPr>
+              <w:pStyle w:val="ListParagraph"/>
+              <w:ind w:left="0"/>
+              <w:rPr>
+                <w:rFonts w:ascii="Times New Roman" w:hAnsi="Times New Roman"/>
+                <w:sz w:val="26"/>
+              </w:rPr>
+            </w:pPr>
+          </w:p>
+        </w:tc>
+        <w:tc>
+          <w:tcPr>
+            <w:tcW w:w="1545" w:type="dxa"/>
           </w:tcPr>
           <w:p>
             <w:pPr>
@@ -787,7 +758,7 @@
         </w:tc>
         <w:tc>
           <w:tcPr>
-            <w:tcW w:w="5026" w:type="dxa"/>
+            <w:tcW w:w="5040" w:type="dxa"/>
           </w:tcPr>
           <w:p>
             <w:pPr>
@@ -809,22 +780,22 @@
         </w:tc>
         <w:tc>
           <w:tcPr>
-            <w:tcW w:w="1274" w:type="dxa"/>
-          </w:tcPr>
-          <w:p>
-            <w:pPr>
-              <w:pStyle w:val="ListParagraph"/>
-              <w:ind w:left="0"/>
-              <w:rPr>
-                <w:rFonts w:ascii="Times New Roman" w:hAnsi="Times New Roman"/>
-                <w:sz w:val="26"/>
-              </w:rPr>
-            </w:pPr>
-          </w:p>
-        </w:tc>
-        <w:tc>
-          <w:tcPr>
-            <w:tcW w:w="1615" w:type="dxa"/>
+            <w:tcW w:w="996" w:type="dxa"/>
+          </w:tcPr>
+          <w:p>
+            <w:pPr>
+              <w:pStyle w:val="ListParagraph"/>
+              <w:ind w:left="0"/>
+              <w:rPr>
+                <w:rFonts w:ascii="Times New Roman" w:hAnsi="Times New Roman"/>
+                <w:sz w:val="26"/>
+              </w:rPr>
+            </w:pPr>
+          </w:p>
+        </w:tc>
+        <w:tc>
+          <w:tcPr>
+            <w:tcW w:w="1545" w:type="dxa"/>
           </w:tcPr>
           <w:p>
             <w:pPr>
@@ -864,7 +835,7 @@
         </w:tc>
         <w:tc>
           <w:tcPr>
-            <w:tcW w:w="5026" w:type="dxa"/>
+            <w:tcW w:w="5040" w:type="dxa"/>
           </w:tcPr>
           <w:p>
             <w:pPr>
@@ -886,22 +857,22 @@
         </w:tc>
         <w:tc>
           <w:tcPr>
-            <w:tcW w:w="1274" w:type="dxa"/>
-          </w:tcPr>
-          <w:p>
-            <w:pPr>
-              <w:pStyle w:val="ListParagraph"/>
-              <w:ind w:left="0"/>
-              <w:rPr>
-                <w:rFonts w:ascii="Times New Roman" w:hAnsi="Times New Roman"/>
-                <w:sz w:val="26"/>
-              </w:rPr>
-            </w:pPr>
-          </w:p>
-        </w:tc>
-        <w:tc>
-          <w:tcPr>
-            <w:tcW w:w="1615" w:type="dxa"/>
+            <w:tcW w:w="996" w:type="dxa"/>
+          </w:tcPr>
+          <w:p>
+            <w:pPr>
+              <w:pStyle w:val="ListParagraph"/>
+              <w:ind w:left="0"/>
+              <w:rPr>
+                <w:rFonts w:ascii="Times New Roman" w:hAnsi="Times New Roman"/>
+                <w:sz w:val="26"/>
+              </w:rPr>
+            </w:pPr>
+          </w:p>
+        </w:tc>
+        <w:tc>
+          <w:tcPr>
+            <w:tcW w:w="1545" w:type="dxa"/>
           </w:tcPr>
           <w:p>
             <w:pPr>
@@ -941,7 +912,7 @@
         </w:tc>
         <w:tc>
           <w:tcPr>
-            <w:tcW w:w="5026" w:type="dxa"/>
+            <w:tcW w:w="5040" w:type="dxa"/>
           </w:tcPr>
           <w:p>
             <w:pPr>
@@ -963,22 +934,22 @@
         </w:tc>
         <w:tc>
           <w:tcPr>
-            <w:tcW w:w="1274" w:type="dxa"/>
-          </w:tcPr>
-          <w:p>
-            <w:pPr>
-              <w:pStyle w:val="ListParagraph"/>
-              <w:ind w:left="0"/>
-              <w:rPr>
-                <w:rFonts w:ascii="Times New Roman" w:hAnsi="Times New Roman"/>
-                <w:sz w:val="26"/>
-              </w:rPr>
-            </w:pPr>
-          </w:p>
-        </w:tc>
-        <w:tc>
-          <w:tcPr>
-            <w:tcW w:w="1615" w:type="dxa"/>
+            <w:tcW w:w="996" w:type="dxa"/>
+          </w:tcPr>
+          <w:p>
+            <w:pPr>
+              <w:pStyle w:val="ListParagraph"/>
+              <w:ind w:left="0"/>
+              <w:rPr>
+                <w:rFonts w:ascii="Times New Roman" w:hAnsi="Times New Roman"/>
+                <w:sz w:val="26"/>
+              </w:rPr>
+            </w:pPr>
+          </w:p>
+        </w:tc>
+        <w:tc>
+          <w:tcPr>
+            <w:tcW w:w="1545" w:type="dxa"/>
           </w:tcPr>
           <w:p>
             <w:pPr>
@@ -1018,7 +989,7 @@
         </w:tc>
         <w:tc>
           <w:tcPr>
-            <w:tcW w:w="5026" w:type="dxa"/>
+            <w:tcW w:w="5040" w:type="dxa"/>
           </w:tcPr>
           <w:p>
             <w:pPr>
@@ -1040,22 +1011,22 @@
         </w:tc>
         <w:tc>
           <w:tcPr>
-            <w:tcW w:w="1274" w:type="dxa"/>
-          </w:tcPr>
-          <w:p>
-            <w:pPr>
-              <w:pStyle w:val="ListParagraph"/>
-              <w:ind w:left="0"/>
-              <w:rPr>
-                <w:rFonts w:ascii="Times New Roman" w:hAnsi="Times New Roman"/>
-                <w:sz w:val="26"/>
-              </w:rPr>
-            </w:pPr>
-          </w:p>
-        </w:tc>
-        <w:tc>
-          <w:tcPr>
-            <w:tcW w:w="1615" w:type="dxa"/>
+            <w:tcW w:w="996" w:type="dxa"/>
+          </w:tcPr>
+          <w:p>
+            <w:pPr>
+              <w:pStyle w:val="ListParagraph"/>
+              <w:ind w:left="0"/>
+              <w:rPr>
+                <w:rFonts w:ascii="Times New Roman" w:hAnsi="Times New Roman"/>
+                <w:sz w:val="26"/>
+              </w:rPr>
+            </w:pPr>
+          </w:p>
+        </w:tc>
+        <w:tc>
+          <w:tcPr>
+            <w:tcW w:w="1545" w:type="dxa"/>
           </w:tcPr>
           <w:p>
             <w:pPr>
@@ -1097,7 +1068,7 @@
         </w:tc>
         <w:tc>
           <w:tcPr>
-            <w:tcW w:w="5026" w:type="dxa"/>
+            <w:tcW w:w="5040" w:type="dxa"/>
           </w:tcPr>
           <w:p>
             <w:pPr>
@@ -1121,22 +1092,22 @@
         </w:tc>
         <w:tc>
           <w:tcPr>
-            <w:tcW w:w="1274" w:type="dxa"/>
-          </w:tcPr>
-          <w:p>
-            <w:pPr>
-              <w:pStyle w:val="ListParagraph"/>
-              <w:ind w:left="0"/>
-              <w:rPr>
-                <w:rFonts w:ascii="Times New Roman" w:hAnsi="Times New Roman"/>
-                <w:sz w:val="26"/>
-              </w:rPr>
-            </w:pPr>
-          </w:p>
-        </w:tc>
-        <w:tc>
-          <w:tcPr>
-            <w:tcW w:w="1615" w:type="dxa"/>
+            <w:tcW w:w="996" w:type="dxa"/>
+          </w:tcPr>
+          <w:p>
+            <w:pPr>
+              <w:pStyle w:val="ListParagraph"/>
+              <w:ind w:left="0"/>
+              <w:rPr>
+                <w:rFonts w:ascii="Times New Roman" w:hAnsi="Times New Roman"/>
+                <w:sz w:val="26"/>
+              </w:rPr>
+            </w:pPr>
+          </w:p>
+        </w:tc>
+        <w:tc>
+          <w:tcPr>
+            <w:tcW w:w="1545" w:type="dxa"/>
           </w:tcPr>
           <w:p>
             <w:pPr>
@@ -1176,7 +1147,7 @@
         </w:tc>
         <w:tc>
           <w:tcPr>
-            <w:tcW w:w="5026" w:type="dxa"/>
+            <w:tcW w:w="5040" w:type="dxa"/>
           </w:tcPr>
           <w:p>
             <w:pPr>
@@ -1198,22 +1169,22 @@
         </w:tc>
         <w:tc>
           <w:tcPr>
-            <w:tcW w:w="1274" w:type="dxa"/>
-          </w:tcPr>
-          <w:p>
-            <w:pPr>
-              <w:pStyle w:val="ListParagraph"/>
-              <w:ind w:left="0"/>
-              <w:rPr>
-                <w:rFonts w:ascii="Times New Roman" w:hAnsi="Times New Roman"/>
-                <w:sz w:val="26"/>
-              </w:rPr>
-            </w:pPr>
-          </w:p>
-        </w:tc>
-        <w:tc>
-          <w:tcPr>
-            <w:tcW w:w="1615" w:type="dxa"/>
+            <w:tcW w:w="996" w:type="dxa"/>
+          </w:tcPr>
+          <w:p>
+            <w:pPr>
+              <w:pStyle w:val="ListParagraph"/>
+              <w:ind w:left="0"/>
+              <w:rPr>
+                <w:rFonts w:ascii="Times New Roman" w:hAnsi="Times New Roman"/>
+                <w:sz w:val="26"/>
+              </w:rPr>
+            </w:pPr>
+          </w:p>
+        </w:tc>
+        <w:tc>
+          <w:tcPr>
+            <w:tcW w:w="1545" w:type="dxa"/>
           </w:tcPr>
           <w:p>
             <w:pPr>
@@ -1253,7 +1224,7 @@
         </w:tc>
         <w:tc>
           <w:tcPr>
-            <w:tcW w:w="5026" w:type="dxa"/>
+            <w:tcW w:w="5040" w:type="dxa"/>
           </w:tcPr>
           <w:p>
             <w:pPr>
@@ -1275,22 +1246,22 @@
         </w:tc>
         <w:tc>
           <w:tcPr>
-            <w:tcW w:w="1274" w:type="dxa"/>
-          </w:tcPr>
-          <w:p>
-            <w:pPr>
-              <w:pStyle w:val="ListParagraph"/>
-              <w:ind w:left="0"/>
-              <w:rPr>
-                <w:rFonts w:ascii="Times New Roman" w:hAnsi="Times New Roman"/>
-                <w:sz w:val="26"/>
-              </w:rPr>
-            </w:pPr>
-          </w:p>
-        </w:tc>
-        <w:tc>
-          <w:tcPr>
-            <w:tcW w:w="1615" w:type="dxa"/>
+            <w:tcW w:w="996" w:type="dxa"/>
+          </w:tcPr>
+          <w:p>
+            <w:pPr>
+              <w:pStyle w:val="ListParagraph"/>
+              <w:ind w:left="0"/>
+              <w:rPr>
+                <w:rFonts w:ascii="Times New Roman" w:hAnsi="Times New Roman"/>
+                <w:sz w:val="26"/>
+              </w:rPr>
+            </w:pPr>
+          </w:p>
+        </w:tc>
+        <w:tc>
+          <w:tcPr>
+            <w:tcW w:w="1545" w:type="dxa"/>
           </w:tcPr>
           <w:p>
             <w:pPr>
@@ -1330,7 +1301,7 @@
         </w:tc>
         <w:tc>
           <w:tcPr>
-            <w:tcW w:w="5026" w:type="dxa"/>
+            <w:tcW w:w="5040" w:type="dxa"/>
           </w:tcPr>
           <w:p>
             <w:pPr>
@@ -1352,22 +1323,22 @@
         </w:tc>
         <w:tc>
           <w:tcPr>
-            <w:tcW w:w="1274" w:type="dxa"/>
-          </w:tcPr>
-          <w:p>
-            <w:pPr>
-              <w:pStyle w:val="ListParagraph"/>
-              <w:ind w:left="0"/>
-              <w:rPr>
-                <w:rFonts w:ascii="Times New Roman" w:hAnsi="Times New Roman"/>
-                <w:sz w:val="26"/>
-              </w:rPr>
-            </w:pPr>
-          </w:p>
-        </w:tc>
-        <w:tc>
-          <w:tcPr>
-            <w:tcW w:w="1615" w:type="dxa"/>
+            <w:tcW w:w="996" w:type="dxa"/>
+          </w:tcPr>
+          <w:p>
+            <w:pPr>
+              <w:pStyle w:val="ListParagraph"/>
+              <w:ind w:left="0"/>
+              <w:rPr>
+                <w:rFonts w:ascii="Times New Roman" w:hAnsi="Times New Roman"/>
+                <w:sz w:val="26"/>
+              </w:rPr>
+            </w:pPr>
+          </w:p>
+        </w:tc>
+        <w:tc>
+          <w:tcPr>
+            <w:tcW w:w="1545" w:type="dxa"/>
           </w:tcPr>
           <w:p>
             <w:pPr>
@@ -1407,7 +1378,7 @@
         </w:tc>
         <w:tc>
           <w:tcPr>
-            <w:tcW w:w="5026" w:type="dxa"/>
+            <w:tcW w:w="5040" w:type="dxa"/>
           </w:tcPr>
           <w:p>
             <w:pPr>
@@ -1429,22 +1400,22 @@
         </w:tc>
         <w:tc>
           <w:tcPr>
-            <w:tcW w:w="1274" w:type="dxa"/>
-          </w:tcPr>
-          <w:p>
-            <w:pPr>
-              <w:pStyle w:val="ListParagraph"/>
-              <w:ind w:left="0"/>
-              <w:rPr>
-                <w:rFonts w:ascii="Times New Roman" w:hAnsi="Times New Roman"/>
-                <w:sz w:val="26"/>
-              </w:rPr>
-            </w:pPr>
-          </w:p>
-        </w:tc>
-        <w:tc>
-          <w:tcPr>
-            <w:tcW w:w="1615" w:type="dxa"/>
+            <w:tcW w:w="996" w:type="dxa"/>
+          </w:tcPr>
+          <w:p>
+            <w:pPr>
+              <w:pStyle w:val="ListParagraph"/>
+              <w:ind w:left="0"/>
+              <w:rPr>
+                <w:rFonts w:ascii="Times New Roman" w:hAnsi="Times New Roman"/>
+                <w:sz w:val="26"/>
+              </w:rPr>
+            </w:pPr>
+          </w:p>
+        </w:tc>
+        <w:tc>
+          <w:tcPr>
+            <w:tcW w:w="1545" w:type="dxa"/>
           </w:tcPr>
           <w:p>
             <w:pPr>
@@ -1486,7 +1457,7 @@
         </w:tc>
         <w:tc>
           <w:tcPr>
-            <w:tcW w:w="5026" w:type="dxa"/>
+            <w:tcW w:w="5040" w:type="dxa"/>
           </w:tcPr>
           <w:p>
             <w:pPr>
@@ -1510,22 +1481,22 @@
         </w:tc>
         <w:tc>
           <w:tcPr>
-            <w:tcW w:w="1274" w:type="dxa"/>
-          </w:tcPr>
-          <w:p>
-            <w:pPr>
-              <w:pStyle w:val="ListParagraph"/>
-              <w:ind w:left="0"/>
-              <w:rPr>
-                <w:rFonts w:ascii="Times New Roman" w:hAnsi="Times New Roman"/>
-                <w:sz w:val="26"/>
-              </w:rPr>
-            </w:pPr>
-          </w:p>
-        </w:tc>
-        <w:tc>
-          <w:tcPr>
-            <w:tcW w:w="1615" w:type="dxa"/>
+            <w:tcW w:w="996" w:type="dxa"/>
+          </w:tcPr>
+          <w:p>
+            <w:pPr>
+              <w:pStyle w:val="ListParagraph"/>
+              <w:ind w:left="0"/>
+              <w:rPr>
+                <w:rFonts w:ascii="Times New Roman" w:hAnsi="Times New Roman"/>
+                <w:sz w:val="26"/>
+              </w:rPr>
+            </w:pPr>
+          </w:p>
+        </w:tc>
+        <w:tc>
+          <w:tcPr>
+            <w:tcW w:w="1545" w:type="dxa"/>
           </w:tcPr>
           <w:p>
             <w:pPr>
@@ -1565,7 +1536,7 @@
         </w:tc>
         <w:tc>
           <w:tcPr>
-            <w:tcW w:w="5026" w:type="dxa"/>
+            <w:tcW w:w="5040" w:type="dxa"/>
           </w:tcPr>
           <w:p>
             <w:pPr>
@@ -1587,22 +1558,22 @@
         </w:tc>
         <w:tc>
           <w:tcPr>
-            <w:tcW w:w="1274" w:type="dxa"/>
-          </w:tcPr>
-          <w:p>
-            <w:pPr>
-              <w:pStyle w:val="ListParagraph"/>
-              <w:ind w:left="0"/>
-              <w:rPr>
-                <w:rFonts w:ascii="Times New Roman" w:hAnsi="Times New Roman"/>
-                <w:sz w:val="26"/>
-              </w:rPr>
-            </w:pPr>
-          </w:p>
-        </w:tc>
-        <w:tc>
-          <w:tcPr>
-            <w:tcW w:w="1615" w:type="dxa"/>
+            <w:tcW w:w="996" w:type="dxa"/>
+          </w:tcPr>
+          <w:p>
+            <w:pPr>
+              <w:pStyle w:val="ListParagraph"/>
+              <w:ind w:left="0"/>
+              <w:rPr>
+                <w:rFonts w:ascii="Times New Roman" w:hAnsi="Times New Roman"/>
+                <w:sz w:val="26"/>
+              </w:rPr>
+            </w:pPr>
+          </w:p>
+        </w:tc>
+        <w:tc>
+          <w:tcPr>
+            <w:tcW w:w="1545" w:type="dxa"/>
           </w:tcPr>
           <w:p>
             <w:pPr>
@@ -1642,7 +1613,7 @@
         </w:tc>
         <w:tc>
           <w:tcPr>
-            <w:tcW w:w="5026" w:type="dxa"/>
+            <w:tcW w:w="5040" w:type="dxa"/>
           </w:tcPr>
           <w:p>
             <w:pPr>
@@ -1664,22 +1635,22 @@
         </w:tc>
         <w:tc>
           <w:tcPr>
-            <w:tcW w:w="1274" w:type="dxa"/>
-          </w:tcPr>
-          <w:p>
-            <w:pPr>
-              <w:pStyle w:val="ListParagraph"/>
-              <w:ind w:left="0"/>
-              <w:rPr>
-                <w:rFonts w:ascii="Times New Roman" w:hAnsi="Times New Roman"/>
-                <w:sz w:val="26"/>
-              </w:rPr>
-            </w:pPr>
-          </w:p>
-        </w:tc>
-        <w:tc>
-          <w:tcPr>
-            <w:tcW w:w="1615" w:type="dxa"/>
+            <w:tcW w:w="996" w:type="dxa"/>
+          </w:tcPr>
+          <w:p>
+            <w:pPr>
+              <w:pStyle w:val="ListParagraph"/>
+              <w:ind w:left="0"/>
+              <w:rPr>
+                <w:rFonts w:ascii="Times New Roman" w:hAnsi="Times New Roman"/>
+                <w:sz w:val="26"/>
+              </w:rPr>
+            </w:pPr>
+          </w:p>
+        </w:tc>
+        <w:tc>
+          <w:tcPr>
+            <w:tcW w:w="1545" w:type="dxa"/>
           </w:tcPr>
           <w:p>
             <w:pPr>
@@ -1721,7 +1692,7 @@
         </w:tc>
         <w:tc>
           <w:tcPr>
-            <w:tcW w:w="5026" w:type="dxa"/>
+            <w:tcW w:w="5040" w:type="dxa"/>
           </w:tcPr>
           <w:p>
             <w:pPr>
@@ -1745,22 +1716,22 @@
         </w:tc>
         <w:tc>
           <w:tcPr>
-            <w:tcW w:w="1274" w:type="dxa"/>
-          </w:tcPr>
-          <w:p>
-            <w:pPr>
-              <w:pStyle w:val="ListParagraph"/>
-              <w:ind w:left="0"/>
-              <w:rPr>
-                <w:rFonts w:ascii="Times New Roman" w:hAnsi="Times New Roman"/>
-                <w:sz w:val="26"/>
-              </w:rPr>
-            </w:pPr>
-          </w:p>
-        </w:tc>
-        <w:tc>
-          <w:tcPr>
-            <w:tcW w:w="1615" w:type="dxa"/>
+            <w:tcW w:w="996" w:type="dxa"/>
+          </w:tcPr>
+          <w:p>
+            <w:pPr>
+              <w:pStyle w:val="ListParagraph"/>
+              <w:ind w:left="0"/>
+              <w:rPr>
+                <w:rFonts w:ascii="Times New Roman" w:hAnsi="Times New Roman"/>
+                <w:sz w:val="26"/>
+              </w:rPr>
+            </w:pPr>
+          </w:p>
+        </w:tc>
+        <w:tc>
+          <w:tcPr>
+            <w:tcW w:w="1545" w:type="dxa"/>
           </w:tcPr>
           <w:p>
             <w:pPr>
@@ -1800,20 +1771,22 @@
         </w:tc>
         <w:tc>
           <w:tcPr>
-            <w:tcW w:w="5026" w:type="dxa"/>
-          </w:tcPr>
-          <w:p>
-            <w:pPr>
-              <w:pStyle w:val="ListParagraph"/>
-              <w:ind w:left="0"/>
-              <w:rPr>
-                <w:rFonts w:ascii="Times New Roman" w:hAnsi="Times New Roman"/>
-                <w:sz w:val="26"/>
-              </w:rPr>
-            </w:pPr>
-            <w:r>
-              <w:rPr>
-                <w:rFonts w:ascii="Times New Roman" w:hAnsi="Times New Roman"/>
+            <w:tcW w:w="5040" w:type="dxa"/>
+          </w:tcPr>
+          <w:p>
+            <w:pPr>
+              <w:pStyle w:val="ListParagraph"/>
+              <w:ind w:left="0"/>
+              <w:rPr>
+                <w:rFonts w:ascii="Times New Roman" w:hAnsi="Times New Roman"/>
+                <w:spacing w:val="2"/>
+                <w:sz w:val="26"/>
+              </w:rPr>
+            </w:pPr>
+            <w:r>
+              <w:rPr>
+                <w:rFonts w:ascii="Times New Roman" w:hAnsi="Times New Roman"/>
+                <w:spacing w:val="2"/>
                 <w:sz w:val="26"/>
               </w:rPr>
               <w:t>Báo cáo đề suất giải ngân kiêm giấy nhận nợ</w:t>
@@ -1822,22 +1795,22 @@
         </w:tc>
         <w:tc>
           <w:tcPr>
-            <w:tcW w:w="1274" w:type="dxa"/>
-          </w:tcPr>
-          <w:p>
-            <w:pPr>
-              <w:pStyle w:val="ListParagraph"/>
-              <w:ind w:left="0"/>
-              <w:rPr>
-                <w:rFonts w:ascii="Times New Roman" w:hAnsi="Times New Roman"/>
-                <w:sz w:val="26"/>
-              </w:rPr>
-            </w:pPr>
-          </w:p>
-        </w:tc>
-        <w:tc>
-          <w:tcPr>
-            <w:tcW w:w="1615" w:type="dxa"/>
+            <w:tcW w:w="996" w:type="dxa"/>
+          </w:tcPr>
+          <w:p>
+            <w:pPr>
+              <w:pStyle w:val="ListParagraph"/>
+              <w:ind w:left="0"/>
+              <w:rPr>
+                <w:rFonts w:ascii="Times New Roman" w:hAnsi="Times New Roman"/>
+                <w:sz w:val="26"/>
+              </w:rPr>
+            </w:pPr>
+          </w:p>
+        </w:tc>
+        <w:tc>
+          <w:tcPr>
+            <w:tcW w:w="1545" w:type="dxa"/>
           </w:tcPr>
           <w:p>
             <w:pPr>
@@ -1877,44 +1850,51 @@
         </w:tc>
         <w:tc>
           <w:tcPr>
-            <w:tcW w:w="5026" w:type="dxa"/>
-          </w:tcPr>
-          <w:p>
-            <w:pPr>
-              <w:pStyle w:val="ListParagraph"/>
-              <w:ind w:left="0"/>
-              <w:rPr>
-                <w:rFonts w:ascii="Times New Roman" w:hAnsi="Times New Roman"/>
-                <w:sz w:val="26"/>
-              </w:rPr>
-            </w:pPr>
-            <w:r>
-              <w:rPr>
-                <w:rFonts w:ascii="Times New Roman" w:hAnsi="Times New Roman"/>
-                <w:sz w:val="26"/>
-              </w:rPr>
-              <w:t>Danh sách người có liên quan</w:t>
-            </w:r>
-          </w:p>
-        </w:tc>
-        <w:tc>
-          <w:tcPr>
-            <w:tcW w:w="1274" w:type="dxa"/>
-          </w:tcPr>
-          <w:p>
-            <w:pPr>
-              <w:pStyle w:val="ListParagraph"/>
-              <w:ind w:left="0"/>
-              <w:rPr>
-                <w:rFonts w:ascii="Times New Roman" w:hAnsi="Times New Roman"/>
-                <w:sz w:val="26"/>
-              </w:rPr>
-            </w:pPr>
-          </w:p>
-        </w:tc>
-        <w:tc>
-          <w:tcPr>
-            <w:tcW w:w="1615" w:type="dxa"/>
+            <w:tcW w:w="5040" w:type="dxa"/>
+          </w:tcPr>
+          <w:p>
+            <w:pPr>
+              <w:pStyle w:val="ListParagraph"/>
+              <w:ind w:left="0"/>
+              <w:rPr>
+                <w:rFonts w:ascii="Times New Roman" w:hAnsi="Times New Roman"/>
+                <w:sz w:val="26"/>
+              </w:rPr>
+            </w:pPr>
+            <w:r>
+              <w:rPr>
+                <w:rFonts w:ascii="Times New Roman" w:hAnsi="Times New Roman"/>
+                <w:sz w:val="26"/>
+              </w:rPr>
+              <w:t>Thông tin</w:t>
+            </w:r>
+            <w:r>
+              <w:rPr>
+                <w:rFonts w:ascii="Times New Roman" w:hAnsi="Times New Roman"/>
+                <w:sz w:val="26"/>
+              </w:rPr>
+              <w:t xml:space="preserve"> người có liên quan</w:t>
+            </w:r>
+          </w:p>
+        </w:tc>
+        <w:tc>
+          <w:tcPr>
+            <w:tcW w:w="996" w:type="dxa"/>
+          </w:tcPr>
+          <w:p>
+            <w:pPr>
+              <w:pStyle w:val="ListParagraph"/>
+              <w:ind w:left="0"/>
+              <w:rPr>
+                <w:rFonts w:ascii="Times New Roman" w:hAnsi="Times New Roman"/>
+                <w:sz w:val="26"/>
+              </w:rPr>
+            </w:pPr>
+          </w:p>
+        </w:tc>
+        <w:tc>
+          <w:tcPr>
+            <w:tcW w:w="1545" w:type="dxa"/>
           </w:tcPr>
           <w:p>
             <w:pPr>
@@ -1954,44 +1934,44 @@
         </w:tc>
         <w:tc>
           <w:tcPr>
-            <w:tcW w:w="5026" w:type="dxa"/>
-          </w:tcPr>
-          <w:p>
-            <w:pPr>
-              <w:pStyle w:val="ListParagraph"/>
-              <w:ind w:left="0"/>
-              <w:rPr>
-                <w:rFonts w:ascii="Times New Roman" w:hAnsi="Times New Roman"/>
-                <w:sz w:val="26"/>
-              </w:rPr>
-            </w:pPr>
-            <w:r>
-              <w:rPr>
-                <w:rFonts w:ascii="Times New Roman" w:hAnsi="Times New Roman"/>
-                <w:sz w:val="26"/>
-              </w:rPr>
-              <w:t>Cam kết nhận tiền mặt</w:t>
-            </w:r>
-          </w:p>
-        </w:tc>
-        <w:tc>
-          <w:tcPr>
-            <w:tcW w:w="1274" w:type="dxa"/>
-          </w:tcPr>
-          <w:p>
-            <w:pPr>
-              <w:pStyle w:val="ListParagraph"/>
-              <w:ind w:left="0"/>
-              <w:rPr>
-                <w:rFonts w:ascii="Times New Roman" w:hAnsi="Times New Roman"/>
-                <w:sz w:val="26"/>
-              </w:rPr>
-            </w:pPr>
-          </w:p>
-        </w:tc>
-        <w:tc>
-          <w:tcPr>
-            <w:tcW w:w="1615" w:type="dxa"/>
+            <w:tcW w:w="5040" w:type="dxa"/>
+          </w:tcPr>
+          <w:p>
+            <w:pPr>
+              <w:pStyle w:val="ListParagraph"/>
+              <w:ind w:left="0"/>
+              <w:rPr>
+                <w:rFonts w:ascii="Times New Roman" w:hAnsi="Times New Roman"/>
+                <w:sz w:val="26"/>
+              </w:rPr>
+            </w:pPr>
+            <w:r>
+              <w:rPr>
+                <w:rFonts w:ascii="Times New Roman" w:hAnsi="Times New Roman"/>
+                <w:sz w:val="26"/>
+              </w:rPr>
+              <w:t>Phụ lục hợp đồng thế chấp</w:t>
+            </w:r>
+          </w:p>
+        </w:tc>
+        <w:tc>
+          <w:tcPr>
+            <w:tcW w:w="996" w:type="dxa"/>
+          </w:tcPr>
+          <w:p>
+            <w:pPr>
+              <w:pStyle w:val="ListParagraph"/>
+              <w:ind w:left="0"/>
+              <w:rPr>
+                <w:rFonts w:ascii="Times New Roman" w:hAnsi="Times New Roman"/>
+                <w:sz w:val="26"/>
+              </w:rPr>
+            </w:pPr>
+          </w:p>
+        </w:tc>
+        <w:tc>
+          <w:tcPr>
+            <w:tcW w:w="1545" w:type="dxa"/>
           </w:tcPr>
           <w:p>
             <w:pPr>
@@ -2031,44 +2011,44 @@
         </w:tc>
         <w:tc>
           <w:tcPr>
-            <w:tcW w:w="5026" w:type="dxa"/>
-          </w:tcPr>
-          <w:p>
-            <w:pPr>
-              <w:pStyle w:val="ListParagraph"/>
-              <w:ind w:left="0"/>
-              <w:rPr>
-                <w:rFonts w:ascii="Times New Roman" w:hAnsi="Times New Roman"/>
-                <w:sz w:val="26"/>
-              </w:rPr>
-            </w:pPr>
-            <w:r>
-              <w:rPr>
-                <w:rFonts w:ascii="Times New Roman" w:hAnsi="Times New Roman"/>
-                <w:sz w:val="26"/>
-              </w:rPr>
-              <w:t>Cam kết đồng trả nợ (nếu có)</w:t>
-            </w:r>
-          </w:p>
-        </w:tc>
-        <w:tc>
-          <w:tcPr>
-            <w:tcW w:w="1274" w:type="dxa"/>
-          </w:tcPr>
-          <w:p>
-            <w:pPr>
-              <w:pStyle w:val="ListParagraph"/>
-              <w:ind w:left="0"/>
-              <w:rPr>
-                <w:rFonts w:ascii="Times New Roman" w:hAnsi="Times New Roman"/>
-                <w:sz w:val="26"/>
-              </w:rPr>
-            </w:pPr>
-          </w:p>
-        </w:tc>
-        <w:tc>
-          <w:tcPr>
-            <w:tcW w:w="1615" w:type="dxa"/>
+            <w:tcW w:w="5040" w:type="dxa"/>
+          </w:tcPr>
+          <w:p>
+            <w:pPr>
+              <w:pStyle w:val="ListParagraph"/>
+              <w:ind w:left="0"/>
+              <w:rPr>
+                <w:rFonts w:ascii="Times New Roman" w:hAnsi="Times New Roman"/>
+                <w:sz w:val="26"/>
+              </w:rPr>
+            </w:pPr>
+            <w:r>
+              <w:rPr>
+                <w:rFonts w:ascii="Times New Roman" w:hAnsi="Times New Roman"/>
+                <w:sz w:val="26"/>
+              </w:rPr>
+              <w:t>Cam kết nhận tiền mặt</w:t>
+            </w:r>
+          </w:p>
+        </w:tc>
+        <w:tc>
+          <w:tcPr>
+            <w:tcW w:w="996" w:type="dxa"/>
+          </w:tcPr>
+          <w:p>
+            <w:pPr>
+              <w:pStyle w:val="ListParagraph"/>
+              <w:ind w:left="0"/>
+              <w:rPr>
+                <w:rFonts w:ascii="Times New Roman" w:hAnsi="Times New Roman"/>
+                <w:sz w:val="26"/>
+              </w:rPr>
+            </w:pPr>
+          </w:p>
+        </w:tc>
+        <w:tc>
+          <w:tcPr>
+            <w:tcW w:w="1545" w:type="dxa"/>
           </w:tcPr>
           <w:p>
             <w:pPr>
@@ -2108,44 +2088,44 @@
         </w:tc>
         <w:tc>
           <w:tcPr>
-            <w:tcW w:w="5026" w:type="dxa"/>
-          </w:tcPr>
-          <w:p>
-            <w:pPr>
-              <w:pStyle w:val="ListParagraph"/>
-              <w:ind w:left="0"/>
-              <w:rPr>
-                <w:rFonts w:ascii="Times New Roman" w:hAnsi="Times New Roman"/>
-                <w:sz w:val="26"/>
-              </w:rPr>
-            </w:pPr>
-            <w:r>
-              <w:rPr>
-                <w:rFonts w:ascii="Times New Roman" w:hAnsi="Times New Roman"/>
-                <w:sz w:val="26"/>
-              </w:rPr>
-              <w:t>Báo cáo tình hình sử dụng vốn vay</w:t>
-            </w:r>
-          </w:p>
-        </w:tc>
-        <w:tc>
-          <w:tcPr>
-            <w:tcW w:w="1274" w:type="dxa"/>
-          </w:tcPr>
-          <w:p>
-            <w:pPr>
-              <w:pStyle w:val="ListParagraph"/>
-              <w:ind w:left="0"/>
-              <w:rPr>
-                <w:rFonts w:ascii="Times New Roman" w:hAnsi="Times New Roman"/>
-                <w:sz w:val="26"/>
-              </w:rPr>
-            </w:pPr>
-          </w:p>
-        </w:tc>
-        <w:tc>
-          <w:tcPr>
-            <w:tcW w:w="1615" w:type="dxa"/>
+            <w:tcW w:w="5040" w:type="dxa"/>
+          </w:tcPr>
+          <w:p>
+            <w:pPr>
+              <w:pStyle w:val="ListParagraph"/>
+              <w:ind w:left="0"/>
+              <w:rPr>
+                <w:rFonts w:ascii="Times New Roman" w:hAnsi="Times New Roman"/>
+                <w:sz w:val="26"/>
+              </w:rPr>
+            </w:pPr>
+            <w:r>
+              <w:rPr>
+                <w:rFonts w:ascii="Times New Roman" w:hAnsi="Times New Roman"/>
+                <w:sz w:val="26"/>
+              </w:rPr>
+              <w:t>Cam kết đồng trả nợ (nếu có)</w:t>
+            </w:r>
+          </w:p>
+        </w:tc>
+        <w:tc>
+          <w:tcPr>
+            <w:tcW w:w="996" w:type="dxa"/>
+          </w:tcPr>
+          <w:p>
+            <w:pPr>
+              <w:pStyle w:val="ListParagraph"/>
+              <w:ind w:left="0"/>
+              <w:rPr>
+                <w:rFonts w:ascii="Times New Roman" w:hAnsi="Times New Roman"/>
+                <w:sz w:val="26"/>
+              </w:rPr>
+            </w:pPr>
+          </w:p>
+        </w:tc>
+        <w:tc>
+          <w:tcPr>
+            <w:tcW w:w="1545" w:type="dxa"/>
           </w:tcPr>
           <w:p>
             <w:pPr>
@@ -2185,44 +2165,44 @@
         </w:tc>
         <w:tc>
           <w:tcPr>
-            <w:tcW w:w="5026" w:type="dxa"/>
-          </w:tcPr>
-          <w:p>
-            <w:pPr>
-              <w:pStyle w:val="ListParagraph"/>
-              <w:ind w:left="0"/>
-              <w:rPr>
-                <w:rFonts w:ascii="Times New Roman" w:hAnsi="Times New Roman"/>
-                <w:sz w:val="26"/>
-              </w:rPr>
-            </w:pPr>
-            <w:r>
-              <w:rPr>
-                <w:rFonts w:ascii="Times New Roman" w:hAnsi="Times New Roman"/>
-                <w:sz w:val="26"/>
-              </w:rPr>
-              <w:t>Chứng minh sử dụng vốn</w:t>
-            </w:r>
-          </w:p>
-        </w:tc>
-        <w:tc>
-          <w:tcPr>
-            <w:tcW w:w="1274" w:type="dxa"/>
-          </w:tcPr>
-          <w:p>
-            <w:pPr>
-              <w:pStyle w:val="ListParagraph"/>
-              <w:ind w:left="0"/>
-              <w:rPr>
-                <w:rFonts w:ascii="Times New Roman" w:hAnsi="Times New Roman"/>
-                <w:sz w:val="26"/>
-              </w:rPr>
-            </w:pPr>
-          </w:p>
-        </w:tc>
-        <w:tc>
-          <w:tcPr>
-            <w:tcW w:w="1615" w:type="dxa"/>
+            <w:tcW w:w="5040" w:type="dxa"/>
+          </w:tcPr>
+          <w:p>
+            <w:pPr>
+              <w:pStyle w:val="ListParagraph"/>
+              <w:ind w:left="0"/>
+              <w:rPr>
+                <w:rFonts w:ascii="Times New Roman" w:hAnsi="Times New Roman"/>
+                <w:sz w:val="26"/>
+              </w:rPr>
+            </w:pPr>
+            <w:r>
+              <w:rPr>
+                <w:rFonts w:ascii="Times New Roman" w:hAnsi="Times New Roman"/>
+                <w:sz w:val="26"/>
+              </w:rPr>
+              <w:t>Báo cáo tình hình sử dụng vốn vay</w:t>
+            </w:r>
+          </w:p>
+        </w:tc>
+        <w:tc>
+          <w:tcPr>
+            <w:tcW w:w="996" w:type="dxa"/>
+          </w:tcPr>
+          <w:p>
+            <w:pPr>
+              <w:pStyle w:val="ListParagraph"/>
+              <w:ind w:left="0"/>
+              <w:rPr>
+                <w:rFonts w:ascii="Times New Roman" w:hAnsi="Times New Roman"/>
+                <w:sz w:val="26"/>
+              </w:rPr>
+            </w:pPr>
+          </w:p>
+        </w:tc>
+        <w:tc>
+          <w:tcPr>
+            <w:tcW w:w="1545" w:type="dxa"/>
           </w:tcPr>
           <w:p>
             <w:pPr>
@@ -2262,7 +2242,84 @@
         </w:tc>
         <w:tc>
           <w:tcPr>
-            <w:tcW w:w="5026" w:type="dxa"/>
+            <w:tcW w:w="5040" w:type="dxa"/>
+          </w:tcPr>
+          <w:p>
+            <w:pPr>
+              <w:pStyle w:val="ListParagraph"/>
+              <w:ind w:left="0"/>
+              <w:rPr>
+                <w:rFonts w:ascii="Times New Roman" w:hAnsi="Times New Roman"/>
+                <w:sz w:val="26"/>
+              </w:rPr>
+            </w:pPr>
+            <w:r>
+              <w:rPr>
+                <w:rFonts w:ascii="Times New Roman" w:hAnsi="Times New Roman"/>
+                <w:sz w:val="26"/>
+              </w:rPr>
+              <w:t>Chứng minh sử dụng vốn</w:t>
+            </w:r>
+          </w:p>
+        </w:tc>
+        <w:tc>
+          <w:tcPr>
+            <w:tcW w:w="996" w:type="dxa"/>
+          </w:tcPr>
+          <w:p>
+            <w:pPr>
+              <w:pStyle w:val="ListParagraph"/>
+              <w:ind w:left="0"/>
+              <w:rPr>
+                <w:rFonts w:ascii="Times New Roman" w:hAnsi="Times New Roman"/>
+                <w:sz w:val="26"/>
+              </w:rPr>
+            </w:pPr>
+          </w:p>
+        </w:tc>
+        <w:tc>
+          <w:tcPr>
+            <w:tcW w:w="1545" w:type="dxa"/>
+          </w:tcPr>
+          <w:p>
+            <w:pPr>
+              <w:pStyle w:val="ListParagraph"/>
+              <w:ind w:left="0"/>
+              <w:rPr>
+                <w:rFonts w:ascii="Times New Roman" w:hAnsi="Times New Roman"/>
+                <w:sz w:val="26"/>
+              </w:rPr>
+            </w:pPr>
+          </w:p>
+        </w:tc>
+      </w:tr>
+      <w:tr>
+        <w:tc>
+          <w:tcPr>
+            <w:tcW w:w="715" w:type="dxa"/>
+          </w:tcPr>
+          <w:p>
+            <w:pPr>
+              <w:pStyle w:val="ListParagraph"/>
+              <w:ind w:left="0"/>
+              <w:jc w:val="center"/>
+              <w:rPr>
+                <w:rFonts w:ascii="Times New Roman" w:hAnsi="Times New Roman"/>
+                <w:sz w:val="26"/>
+              </w:rPr>
+            </w:pPr>
+            <w:r>
+              <w:rPr>
+                <w:rFonts w:ascii="Times New Roman" w:hAnsi="Times New Roman"/>
+                <w:sz w:val="26"/>
+              </w:rPr>
+              <w:t>+</w:t>
+            </w:r>
+          </w:p>
+        </w:tc>
+        <w:tc>
+          <w:tcPr>
+            <w:tcW w:w="5040" w:type="dxa"/>
           </w:tcPr>
           <w:p>
             <w:pPr>
@@ -2284,22 +2341,22 @@
         </w:tc>
         <w:tc>
           <w:tcPr>
-            <w:tcW w:w="1274" w:type="dxa"/>
-          </w:tcPr>
-          <w:p>
-            <w:pPr>
-              <w:pStyle w:val="ListParagraph"/>
-              <w:ind w:left="0"/>
-              <w:rPr>
-                <w:rFonts w:ascii="Times New Roman" w:hAnsi="Times New Roman"/>
-                <w:sz w:val="26"/>
-              </w:rPr>
-            </w:pPr>
-          </w:p>
-        </w:tc>
-        <w:tc>
-          <w:tcPr>
-            <w:tcW w:w="1615" w:type="dxa"/>
+            <w:tcW w:w="996" w:type="dxa"/>
+          </w:tcPr>
+          <w:p>
+            <w:pPr>
+              <w:pStyle w:val="ListParagraph"/>
+              <w:ind w:left="0"/>
+              <w:rPr>
+                <w:rFonts w:ascii="Times New Roman" w:hAnsi="Times New Roman"/>
+                <w:sz w:val="26"/>
+              </w:rPr>
+            </w:pPr>
+          </w:p>
+        </w:tc>
+        <w:tc>
+          <w:tcPr>
+            <w:tcW w:w="1545" w:type="dxa"/>
           </w:tcPr>
           <w:p>
             <w:pPr>
@@ -2330,6 +2387,25 @@
         </w:rPr>
         <w:t xml:space="preserve">                     </w:t>
       </w:r>
+    </w:p>
+    <w:p>
+      <w:pPr>
+        <w:rPr>
+          <w:rFonts w:ascii="Times New Roman" w:hAnsi="Times New Roman"/>
+          <w:b/>
+          <w:sz w:val="26"/>
+        </w:rPr>
+      </w:pPr>
+      <w:r>
+        <w:rPr>
+          <w:rFonts w:ascii="Times New Roman" w:hAnsi="Times New Roman"/>
+          <w:b/>
+          <w:sz w:val="26"/>
+        </w:rPr>
+        <w:t xml:space="preserve">                    </w:t>
+      </w:r>
+      <w:bookmarkStart w:id="0" w:name="_GoBack"/>
+      <w:bookmarkEnd w:id="0"/>
       <w:r>
         <w:rPr>
           <w:rFonts w:ascii="Times New Roman" w:hAnsi="Times New Roman"/>
@@ -2364,7 +2440,7 @@
       </w:r>
     </w:p>
     <w:sectPr>
-      <w:pgSz w:w="12240" w:h="15840"/>
+      <w:pgSz w:w="11906" w:h="16838" w:code="9"/>
       <w:pgMar w:top="1440" w:right="1440" w:bottom="1440" w:left="1440" w:header="720" w:footer="720" w:gutter="0"/>
       <w:cols w:space="720"/>
       <w:docGrid w:linePitch="360"/>

</xml_diff>